<commit_message>
Adiciona link do video da apresentacao
</commit_message>
<xml_diff>
--- a/entregaveis/relatorio_executivo_state_of_data.docx
+++ b/entregaveis/relatorio_executivo_state_of_data.docx
@@ -101,7 +101,7 @@
           <w:sz w:val="18"/>
           <w:szCs w:val="18"/>
         </w:rPr>
-        <w:t xml:space="preserve">Vídeo executivo: youtu.be/SEU-VIDEO-AQUI</w:t>
+        <w:t xml:space="preserve">Vídeo executivo: youtu.be/bsXQTBa6kuA</w:t>
       </w:r>
     </w:p>
     <w:p>
@@ -1636,7 +1636,7 @@
           <w:sz w:val="22"/>
           <w:szCs w:val="22"/>
         </w:rPr>
-        <w:t xml:space="preserve">youtu.be/SEU-VIDEO-AQUI</w:t>
+        <w:t xml:space="preserve">youtu.be/bsXQTBa6kuA</w:t>
       </w:r>
     </w:p>
     <w:p>

</xml_diff>